<commit_message>
Don't expand columns beyond grid widths for declared-width tables
Parse tblW to distinguish auto-width tables (tblW type="auto") from
declared-width tables (tblW type="dxa"). For declared-width tables,
cap auto_fit min_widths at the grid column widths so narrow columns
stay narrow instead of stealing space from neighbors.

Auto-width tables (like case6) can still expand columns freely.

Also updates case61 fixture to use declared-width tables, matching
real-world documents like japanese_interlibrary_loan.

Co-Authored-By: Claude Opus 4.6 (1M context) <noreply@anthropic.com>
</commit_message>
<xml_diff>
--- a/tests/fixtures/cases/case61/input.docx
+++ b/tests/fixtures/cases/case61/input.docx
@@ -154,7 +154,7 @@
     <w:tbl>
       <w:tblPr>
         <w:tblStyle w:val="TableGrid"/>
-        <w:tblW w:type="auto" w:w="0"/>
+        <w:tblW w:type="dxa" w:w="8200"/>
         <w:tblLook w:firstColumn="1" w:firstRow="1" w:lastColumn="0" w:lastRow="0" w:noHBand="0" w:noVBand="1" w:val="04A0"/>
       </w:tblPr>
       <w:tblGrid>
@@ -302,7 +302,7 @@
     <w:tbl>
       <w:tblPr>
         <w:tblStyle w:val="TableGrid"/>
-        <w:tblW w:type="auto" w:w="0"/>
+        <w:tblW w:type="dxa" w:w="6450"/>
         <w:tblLook w:firstColumn="1" w:firstRow="1" w:lastColumn="0" w:lastRow="0" w:noHBand="0" w:noVBand="1" w:val="04A0"/>
       </w:tblPr>
       <w:tblGrid>
@@ -398,7 +398,7 @@
     <w:tbl>
       <w:tblPr>
         <w:tblStyle w:val="TableGrid"/>
-        <w:tblW w:type="auto" w:w="0"/>
+        <w:tblW w:type="dxa" w:w="11050"/>
         <w:tblLook w:firstColumn="1" w:firstRow="1" w:lastColumn="0" w:lastRow="0" w:noHBand="0" w:noVBand="1" w:val="04A0"/>
       </w:tblPr>
       <w:tblGrid>

</xml_diff>